<commit_message>
docs: sumarul pentru management (ce colectam / ce urmeaza), MD + Word + PDF
</commit_message>
<xml_diff>
--- a/docs/SUMAR_DATE.docx
+++ b/docs/SUMAR_DATE.docx
@@ -10,7 +10,7 @@
         <w:rPr>
           <w:color w:val="142B4C"/>
         </w:rPr>
-        <w:t>MIP — sumarul datelor colectate</w:t>
+        <w:t>MIP — ce date colectăm</w:t>
       </w:r>
     </w:p>
     <w:p>
@@ -18,7 +18,7 @@
         <w:rPr>
           <w:i/>
         </w:rPr>
-        <w:t>Stare la 24.09.2026. Reper: „Arhitectura Market Intelligence Libra" (DRAFT, 09.09.2026), secțiunea 2.</w:t>
+        <w:t>Stare la 24.09.2026 · 30 de bănci urmărite, 23 cu date · categorii conform „Arhitectura Market Intelligence Libra" (secțiunea 2).</w:t>
       </w:r>
     </w:p>
     <w:p>
@@ -29,7 +29,7 @@
         <w:rPr>
           <w:color w:val="142B4C"/>
         </w:rPr>
-        <w:t>Pe scurt</w:t>
+        <w:t>1. Ce colectăm în prezent</w:t>
       </w:r>
     </w:p>
     <w:tbl>
@@ -58,7 +58,7 @@
                 <w:b/>
                 <w:color w:val="FFFFFF"/>
               </w:rPr>
-              <w:t>Bănci urmărite</w:t>
+              <w:t>Categorie</w:t>
             </w:r>
           </w:p>
         </w:tc>
@@ -76,7 +76,7 @@
                 <w:b/>
                 <w:color w:val="FFFFFF"/>
               </w:rPr>
-              <w:t>30</w:t>
+              <w:t>Ce conține</w:t>
             </w:r>
           </w:p>
         </w:tc>
@@ -91,7 +91,13 @@
               <w:spacing w:after="0"/>
             </w:pPr>
             <w:r>
-              <w:t>Bănci cu date</w:t>
+              <w:rPr>
+                <w:b/>
+              </w:rPr>
+              <w:t>Comisioane</w:t>
+            </w:r>
+            <w:r>
+              <w:t xml:space="preserve"> (2.1)</w:t>
             </w:r>
           </w:p>
         </w:tc>
@@ -104,7 +110,7 @@
               <w:spacing w:after="0"/>
             </w:pPr>
             <w:r>
-              <w:t>23</w:t>
+              <w:t>Cont curent și pachete, carduri, transferuri, retrageri de numerar — PF și PJ, pe variante de card, doar versiunea în vigoare</w:t>
             </w:r>
           </w:p>
         </w:tc>
@@ -120,7 +126,13 @@
               <w:spacing w:after="0"/>
             </w:pPr>
             <w:r>
-              <w:t>Bănci blocate (documentate, fără alt canal)</w:t>
+              <w:rPr>
+                <w:b/>
+              </w:rPr>
+              <w:t>Catalog de produse</w:t>
+            </w:r>
+            <w:r>
+              <w:t xml:space="preserve"> (2.1)</w:t>
             </w:r>
           </w:p>
         </w:tc>
@@ -134,7 +146,7 @@
               <w:spacing w:after="0"/>
             </w:pPr>
             <w:r>
-              <w:t>5 — BT, CEC, Intesa, UniCredit, Revolut</w:t>
+              <w:t>Numele produselor: conturi, carduri, credite, depozite</w:t>
             </w:r>
           </w:p>
         </w:tc>
@@ -149,7 +161,13 @@
               <w:spacing w:after="0"/>
             </w:pPr>
             <w:r>
-              <w:t>Surse web descoperite / active</w:t>
+              <w:rPr>
+                <w:b/>
+              </w:rPr>
+              <w:t>Depozite</w:t>
+            </w:r>
+            <w:r>
+              <w:t xml:space="preserve"> (2.1)</w:t>
             </w:r>
           </w:p>
         </w:tc>
@@ -162,7 +180,7 @@
               <w:spacing w:after="0"/>
             </w:pPr>
             <w:r>
-              <w:t>5.840 / 2.152</w:t>
+              <w:t>Dobânzi pe termene și monede</w:t>
             </w:r>
           </w:p>
         </w:tc>
@@ -178,7 +196,13 @@
               <w:spacing w:after="0"/>
             </w:pPr>
             <w:r>
-              <w:t>Valori colectate (prețuri, comisioane, dobânzi)</w:t>
+              <w:rPr>
+                <w:b/>
+              </w:rPr>
+              <w:t>Dobânzi la credite</w:t>
+            </w:r>
+            <w:r>
+              <w:t xml:space="preserve"> (2.2)</w:t>
             </w:r>
           </w:p>
         </w:tc>
@@ -192,7 +216,7 @@
               <w:spacing w:after="0"/>
             </w:pPr>
             <w:r>
-              <w:t>27.218</w:t>
+              <w:t>Dobândă nominală, DAE, marjă peste IRCC — nevoi personale, ipotecar, refinanțare</w:t>
             </w:r>
           </w:p>
         </w:tc>
@@ -207,7 +231,13 @@
               <w:spacing w:after="0"/>
             </w:pPr>
             <w:r>
-              <w:t>Valori „curate" (verificabile și comparabile)</w:t>
+              <w:rPr>
+                <w:b/>
+              </w:rPr>
+              <w:t>Curs valutar propriu</w:t>
+            </w:r>
+            <w:r>
+              <w:t xml:space="preserve"> (2.2)</w:t>
             </w:r>
           </w:p>
         </w:tc>
@@ -220,7 +250,7 @@
               <w:spacing w:after="0"/>
             </w:pPr>
             <w:r>
-              <w:t>14.722 (54%)</w:t>
+              <w:t>Cursul afișat de bancă</w:t>
             </w:r>
           </w:p>
         </w:tc>
@@ -236,7 +266,13 @@
               <w:spacing w:after="0"/>
             </w:pPr>
             <w:r>
-              <w:t>Citate regăsite în sursă</w:t>
+              <w:rPr>
+                <w:b/>
+              </w:rPr>
+              <w:t>Indici de referință BNR</w:t>
+            </w:r>
+            <w:r>
+              <w:t xml:space="preserve"> (2.2)</w:t>
             </w:r>
           </w:p>
         </w:tc>
@@ -250,7 +286,7 @@
               <w:spacing w:after="0"/>
             </w:pPr>
             <w:r>
-              <w:t>HTML 100% · PDF 99% (eșantion)</w:t>
+              <w:t>ROBOR și ROBID zilnic (7 scadențe), IRCC trimestrial</w:t>
             </w:r>
           </w:p>
         </w:tc>
@@ -265,7 +301,13 @@
               <w:spacing w:after="0"/>
             </w:pPr>
             <w:r>
-              <w:t>Valori datate (dată de vigoare)</w:t>
+              <w:rPr>
+                <w:b/>
+              </w:rPr>
+              <w:t>Aplicații mobile iOS</w:t>
+            </w:r>
+            <w:r>
+              <w:t xml:space="preserve"> (2.3)</w:t>
             </w:r>
           </w:p>
         </w:tc>
@@ -278,7 +320,7 @@
               <w:spacing w:after="0"/>
             </w:pPr>
             <w:r>
-              <w:t>69%</w:t>
+              <w:t>Versiune, rating, număr de note, distribuția pe stele, capturi din store</w:t>
             </w:r>
           </w:p>
         </w:tc>
@@ -294,7 +336,13 @@
               <w:spacing w:after="0"/>
             </w:pPr>
             <w:r>
-              <w:t>În coada de verificare umană</w:t>
+              <w:rPr>
+                <w:b/>
+              </w:rPr>
+              <w:t>Rețea</w:t>
+            </w:r>
+            <w:r>
+              <w:t xml:space="preserve"> (2.5)</w:t>
             </w:r>
           </w:p>
         </w:tc>
@@ -308,7 +356,7 @@
               <w:spacing w:after="0"/>
             </w:pPr>
             <w:r>
-              <w:t>5.395</w:t>
+              <w:t>Sucursale și ATM-uri pe hartă, cu adresă; ATM-uri partenere marcate separat</w:t>
             </w:r>
           </w:p>
         </w:tc>
@@ -323,7 +371,13 @@
               <w:spacing w:after="0"/>
             </w:pPr>
             <w:r>
-              <w:t>Schimbări de preț detectate (istoric)</w:t>
+              <w:rPr>
+                <w:b/>
+              </w:rPr>
+              <w:t>Recenzii App Store</w:t>
+            </w:r>
+            <w:r>
+              <w:t xml:space="preserve"> (2.7)</w:t>
             </w:r>
           </w:p>
         </w:tc>
@@ -336,7 +390,40 @@
               <w:spacing w:after="0"/>
             </w:pPr>
             <w:r>
-              <w:t>996</w:t>
+              <w:t>Recenzii publice, cu nota și răspunsul băncii; autor pseudonimizat</w:t>
+            </w:r>
+          </w:p>
+        </w:tc>
+      </w:tr>
+      <w:tr>
+        <w:tc>
+          <w:tcPr>
+            <w:tcW w:type="dxa" w:w="4986"/>
+            <w:shd w:val="clear" w:color="auto" w:fill="EEF1F5"/>
+          </w:tcPr>
+          <w:p>
+            <w:pPr>
+              <w:spacing w:after="0"/>
+            </w:pPr>
+            <w:r>
+              <w:rPr>
+                <w:b/>
+              </w:rPr>
+              <w:t>Istoric de prețuri</w:t>
+            </w:r>
+          </w:p>
+        </w:tc>
+        <w:tc>
+          <w:tcPr>
+            <w:tcW w:type="dxa" w:w="4986"/>
+            <w:shd w:val="clear" w:color="auto" w:fill="EEF1F5"/>
+          </w:tcPr>
+          <w:p>
+            <w:pPr>
+              <w:spacing w:after="0"/>
+            </w:pPr>
+            <w:r>
+              <w:t>Schimbările de comisioane între versiunile documentelor</w:t>
             </w:r>
           </w:p>
         </w:tc>
@@ -351,7 +438,7 @@
         <w:rPr>
           <w:color w:val="142B4C"/>
         </w:rPr>
-        <w:t>Ce avem, pe secțiunile din PDF</w:t>
+        <w:t>2. Urmează să fie dezvoltate</w:t>
       </w:r>
     </w:p>
     <w:tbl>
@@ -381,7 +468,7 @@
                 <w:b/>
                 <w:color w:val="FFFFFF"/>
               </w:rPr>
-              <w:t>Secțiune</w:t>
+              <w:t>Categorie</w:t>
             </w:r>
           </w:p>
         </w:tc>
@@ -399,7 +486,7 @@
                 <w:b/>
                 <w:color w:val="FFFFFF"/>
               </w:rPr>
-              <w:t>Colectat</w:t>
+              <w:t>Ce ar conține</w:t>
             </w:r>
           </w:p>
         </w:tc>
@@ -417,7 +504,7 @@
                 <w:b/>
                 <w:color w:val="FFFFFF"/>
               </w:rPr>
-              <w:t>Bănci</w:t>
+              <w:t>Stare</w:t>
             </w:r>
           </w:p>
         </w:tc>
@@ -435,7 +522,7 @@
               <w:rPr>
                 <w:b/>
               </w:rPr>
-              <w:t>2.1 Produse &amp; prețuri</w:t>
+              <w:t>Bănci blocate</w:t>
             </w:r>
           </w:p>
         </w:tc>
@@ -448,7 +535,7 @@
               <w:spacing w:after="0"/>
             </w:pPr>
             <w:r>
-              <w:t>23.080 de comisioane (PDF-uri de tarife + pagini); 607 produse în catalog; 100 de valori la depozite</w:t>
+              <w:t>Datele din capitolul 1 pentru BT, CEC, Intesa, UniCredit, Revolut</w:t>
             </w:r>
           </w:p>
         </w:tc>
@@ -461,7 +548,7 @@
               <w:spacing w:after="0"/>
             </w:pPr>
             <w:r>
-              <w:t>19–23</w:t>
+              <w:t>în așteptare</w:t>
             </w:r>
           </w:p>
         </w:tc>
@@ -480,7 +567,10 @@
               <w:rPr>
                 <w:b/>
               </w:rPr>
-              <w:t>2.2 Rate &amp; indicatori</w:t>
+              <w:t>Curs de referință BNR</w:t>
+            </w:r>
+            <w:r>
+              <w:t xml:space="preserve"> (2.2)</w:t>
             </w:r>
           </w:p>
         </w:tc>
@@ -494,7 +584,7 @@
               <w:spacing w:after="0"/>
             </w:pPr>
             <w:r>
-              <w:t>322 dobânzi nominale · 88 DAE · 58 marje peste IRCC; curs propriu la 13 bănci</w:t>
+              <w:t>Cursul oficial BNR zilnic</w:t>
             </w:r>
           </w:p>
         </w:tc>
@@ -508,7 +598,7 @@
               <w:spacing w:after="0"/>
             </w:pPr>
             <w:r>
-              <w:t>8–17</w:t>
+              <w:t>în așteptare</w:t>
             </w:r>
           </w:p>
         </w:tc>
@@ -526,7 +616,10 @@
               <w:rPr>
                 <w:b/>
               </w:rPr>
-              <w:t>2.3 Aplicații mobile</w:t>
+              <w:t>EURIBOR</w:t>
+            </w:r>
+            <w:r>
+              <w:t xml:space="preserve"> (2.2)</w:t>
             </w:r>
           </w:p>
         </w:tc>
@@ -539,16 +632,7 @@
               <w:spacing w:after="0"/>
             </w:pPr>
             <w:r>
-              <w:t xml:space="preserve">19 aplicații iOS: versiune, rating, </w:t>
-            </w:r>
-            <w:r>
-              <w:rPr>
-                <w:b/>
-              </w:rPr>
-              <w:t>distribuția pe stele</w:t>
-            </w:r>
-            <w:r>
-              <w:t xml:space="preserve"> (17), 130 de capturi, 120 de recenzii</w:t>
+              <w:t>Indicele de referință pentru creditele în euro</w:t>
             </w:r>
           </w:p>
         </w:tc>
@@ -561,7 +645,7 @@
               <w:spacing w:after="0"/>
             </w:pPr>
             <w:r>
-              <w:t>19</w:t>
+              <w:t>propus</w:t>
             </w:r>
           </w:p>
         </w:tc>
@@ -580,7 +664,10 @@
               <w:rPr>
                 <w:b/>
               </w:rPr>
-              <w:t>2.5 Rețea</w:t>
+              <w:t>Aplicații Android</w:t>
+            </w:r>
+            <w:r>
+              <w:t xml:space="preserve"> (2.3)</w:t>
             </w:r>
           </w:p>
         </w:tc>
@@ -594,7 +681,7 @@
               <w:spacing w:after="0"/>
             </w:pPr>
             <w:r>
-              <w:t>852 de sucursale · 54 de ATM-uri proprii · 572 de ATM-uri partenere (Patria/Euronet)</w:t>
+              <w:t>Versiuni, rating, funcționalități din Google Play</w:t>
             </w:r>
           </w:p>
         </w:tc>
@@ -608,7 +695,7 @@
               <w:spacing w:after="0"/>
             </w:pPr>
             <w:r>
-              <w:t>19</w:t>
+              <w:t>propus</w:t>
             </w:r>
           </w:p>
         </w:tc>
@@ -626,7 +713,10 @@
               <w:rPr>
                 <w:b/>
               </w:rPr>
-              <w:t>2.7 Sentiment</w:t>
+              <w:t>Campanii &amp; marketing</w:t>
+            </w:r>
+            <w:r>
+              <w:t xml:space="preserve"> (2.4)</w:t>
             </w:r>
           </w:p>
         </w:tc>
@@ -639,7 +729,7 @@
               <w:spacing w:after="0"/>
             </w:pPr>
             <w:r>
-              <w:t>120 de recenzii App Store, pseudonimizate, 41 cu răspunsul băncii</w:t>
+              <w:t>Reclame active (Meta, TikTok, YouTube), pagini de campanie, promoții, comunicate de presă</w:t>
             </w:r>
           </w:p>
         </w:tc>
@@ -652,669 +742,7 @@
               <w:spacing w:after="0"/>
             </w:pPr>
             <w:r>
-              <w:t>16</w:t>
-            </w:r>
-          </w:p>
-        </w:tc>
-      </w:tr>
-    </w:tbl>
-    <w:p/>
-    <w:p>
-      <w:pPr>
-        <w:pStyle w:val="Heading1"/>
-      </w:pPr>
-      <w:r>
-        <w:rPr>
-          <w:color w:val="142B4C"/>
-        </w:rPr>
-        <w:t>Ce nu am colectat încă</w:t>
-      </w:r>
-    </w:p>
-    <w:tbl>
-      <w:tblPr>
-        <w:tblStyle w:val="TableGrid"/>
-        <w:tblW w:type="auto" w:w="0"/>
-        <w:jc w:val="center"/>
-        <w:tblLook w:firstColumn="1" w:firstRow="1" w:lastColumn="0" w:lastRow="0" w:noHBand="0" w:noVBand="1" w:val="04A0"/>
-      </w:tblPr>
-      <w:tblGrid>
-        <w:gridCol w:w="3324"/>
-        <w:gridCol w:w="3324"/>
-        <w:gridCol w:w="3324"/>
-      </w:tblGrid>
-      <w:tr>
-        <w:tc>
-          <w:tcPr>
-            <w:tcW w:type="dxa" w:w="3324"/>
-            <w:shd w:val="clear" w:color="auto" w:fill="142B4C"/>
-          </w:tcPr>
-          <w:p>
-            <w:pPr>
-              <w:spacing w:after="0"/>
-            </w:pPr>
-            <w:r>
-              <w:rPr>
-                <w:b/>
-                <w:color w:val="FFFFFF"/>
-              </w:rPr>
-              <w:t>Secțiune din PDF</w:t>
-            </w:r>
-          </w:p>
-        </w:tc>
-        <w:tc>
-          <w:tcPr>
-            <w:tcW w:type="dxa" w:w="3324"/>
-            <w:shd w:val="clear" w:color="auto" w:fill="142B4C"/>
-          </w:tcPr>
-          <w:p>
-            <w:pPr>
-              <w:spacing w:after="0"/>
-            </w:pPr>
-            <w:r>
-              <w:rPr>
-                <w:b/>
-                <w:color w:val="FFFFFF"/>
-              </w:rPr>
-              <w:t>Lipsește</w:t>
-            </w:r>
-          </w:p>
-        </w:tc>
-        <w:tc>
-          <w:tcPr>
-            <w:tcW w:type="dxa" w:w="3324"/>
-            <w:shd w:val="clear" w:color="auto" w:fill="142B4C"/>
-          </w:tcPr>
-          <w:p>
-            <w:pPr>
-              <w:spacing w:after="0"/>
-            </w:pPr>
-            <w:r>
-              <w:rPr>
-                <w:b/>
-                <w:color w:val="FFFFFF"/>
-              </w:rPr>
-              <w:t>Motiv / următorul pas</w:t>
-            </w:r>
-          </w:p>
-        </w:tc>
-      </w:tr>
-      <w:tr>
-        <w:tc>
-          <w:tcPr>
-            <w:tcW w:type="dxa" w:w="3324"/>
-          </w:tcPr>
-          <w:p>
-            <w:pPr>
-              <w:spacing w:after="0"/>
-            </w:pPr>
-            <w:r>
-              <w:t>2.1</w:t>
-            </w:r>
-          </w:p>
-        </w:tc>
-        <w:tc>
-          <w:tcPr>
-            <w:tcW w:type="dxa" w:w="3324"/>
-          </w:tcPr>
-          <w:p>
-            <w:pPr>
-              <w:spacing w:after="0"/>
-            </w:pPr>
-            <w:r>
-              <w:t>Comisioanele ING</w:t>
-            </w:r>
-          </w:p>
-        </w:tc>
-        <w:tc>
-          <w:tcPr>
-            <w:tcW w:type="dxa" w:w="3324"/>
-          </w:tcPr>
-          <w:p>
-            <w:pPr>
-              <w:spacing w:after="0"/>
-            </w:pPr>
-            <w:r>
-              <w:t>robots.txt interzice PDF-urile ING</w:t>
-            </w:r>
-          </w:p>
-        </w:tc>
-      </w:tr>
-      <w:tr>
-        <w:tc>
-          <w:tcPr>
-            <w:tcW w:type="dxa" w:w="3324"/>
-            <w:shd w:val="clear" w:color="auto" w:fill="EEF1F5"/>
-          </w:tcPr>
-          <w:p>
-            <w:pPr>
-              <w:spacing w:after="0"/>
-            </w:pPr>
-            <w:r>
-              <w:t>2.1</w:t>
-            </w:r>
-          </w:p>
-        </w:tc>
-        <w:tc>
-          <w:tcPr>
-            <w:tcW w:type="dxa" w:w="3324"/>
-            <w:shd w:val="clear" w:color="auto" w:fill="EEF1F5"/>
-          </w:tcPr>
-          <w:p>
-            <w:pPr>
-              <w:spacing w:after="0"/>
-            </w:pPr>
-            <w:r>
-              <w:t>Toate datele BT, CEC, Intesa, UniCredit, Revolut</w:t>
-            </w:r>
-          </w:p>
-        </w:tc>
-        <w:tc>
-          <w:tcPr>
-            <w:tcW w:type="dxa" w:w="3324"/>
-            <w:shd w:val="clear" w:color="auto" w:fill="EEF1F5"/>
-          </w:tcPr>
-          <w:p>
-            <w:pPr>
-              <w:spacing w:after="0"/>
-            </w:pPr>
-            <w:r>
-              <w:t>ne blochează (403); doar pe o cale aprobată</w:t>
-            </w:r>
-          </w:p>
-        </w:tc>
-      </w:tr>
-      <w:tr>
-        <w:tc>
-          <w:tcPr>
-            <w:tcW w:type="dxa" w:w="3324"/>
-          </w:tcPr>
-          <w:p>
-            <w:pPr>
-              <w:spacing w:after="0"/>
-            </w:pPr>
-            <w:r>
-              <w:t>2.1</w:t>
-            </w:r>
-          </w:p>
-        </w:tc>
-        <w:tc>
-          <w:tcPr>
-            <w:tcW w:type="dxa" w:w="3324"/>
-          </w:tcPr>
-          <w:p>
-            <w:pPr>
-              <w:spacing w:after="0"/>
-            </w:pPr>
-            <w:r>
-              <w:t>IMM &amp; corporate (factoring, leasing, cash management) — acoperire slabă</w:t>
-            </w:r>
-          </w:p>
-        </w:tc>
-        <w:tc>
-          <w:tcPr>
-            <w:tcW w:type="dxa" w:w="3324"/>
-          </w:tcPr>
-          <w:p>
-            <w:pPr>
-              <w:spacing w:after="0"/>
-            </w:pPr>
-            <w:r>
-              <w:t>de verificat pe bancă</w:t>
-            </w:r>
-          </w:p>
-        </w:tc>
-      </w:tr>
-      <w:tr>
-        <w:tc>
-          <w:tcPr>
-            <w:tcW w:type="dxa" w:w="3324"/>
-            <w:shd w:val="clear" w:color="auto" w:fill="EEF1F5"/>
-          </w:tcPr>
-          <w:p>
-            <w:pPr>
-              <w:spacing w:after="0"/>
-            </w:pPr>
-            <w:r>
-              <w:t>2.2</w:t>
-            </w:r>
-          </w:p>
-        </w:tc>
-        <w:tc>
-          <w:tcPr>
-            <w:tcW w:type="dxa" w:w="3324"/>
-            <w:shd w:val="clear" w:color="auto" w:fill="EEF1F5"/>
-          </w:tcPr>
-          <w:p>
-            <w:pPr>
-              <w:spacing w:after="0"/>
-            </w:pPr>
-            <w:r>
-              <w:t>Dobânzi din PDF-urile de dobânzi (BCR, BRD, tbi)</w:t>
-            </w:r>
-          </w:p>
-        </w:tc>
-        <w:tc>
-          <w:tcPr>
-            <w:tcW w:type="dxa" w:w="3324"/>
-            <w:shd w:val="clear" w:color="auto" w:fill="EEF1F5"/>
-          </w:tcPr>
-          <w:p>
-            <w:pPr>
-              <w:spacing w:after="0"/>
-            </w:pPr>
-            <w:r>
-              <w:t>trec prin parserul de tarife; de rutat la cel de dobânzi</w:t>
-            </w:r>
-          </w:p>
-        </w:tc>
-      </w:tr>
-      <w:tr>
-        <w:tc>
-          <w:tcPr>
-            <w:tcW w:type="dxa" w:w="3324"/>
-          </w:tcPr>
-          <w:p>
-            <w:pPr>
-              <w:spacing w:after="0"/>
-            </w:pPr>
-            <w:r>
-              <w:t>2.2</w:t>
-            </w:r>
-          </w:p>
-        </w:tc>
-        <w:tc>
-          <w:tcPr>
-            <w:tcW w:type="dxa" w:w="3324"/>
-          </w:tcPr>
-          <w:p>
-            <w:pPr>
-              <w:spacing w:after="0"/>
-            </w:pPr>
-            <w:r>
-              <w:t>Curs de referință BNR</w:t>
-            </w:r>
-          </w:p>
-        </w:tc>
-        <w:tc>
-          <w:tcPr>
-            <w:tcW w:type="dxa" w:w="3324"/>
-          </w:tcPr>
-          <w:p>
-            <w:pPr>
-              <w:spacing w:after="0"/>
-            </w:pPr>
-            <w:r>
-              <w:t xml:space="preserve">feed-ul </w:t>
-            </w:r>
-            <w:r>
-              <w:rPr>
-                <w:rFonts w:ascii="Consolas" w:hAnsi="Consolas"/>
-                <w:sz w:val="19"/>
-              </w:rPr>
-              <w:t>curs.bnr.ro</w:t>
-            </w:r>
-            <w:r>
-              <w:t xml:space="preserve"> e interzis de robots.txt; de găsit pagina de pe </w:t>
-            </w:r>
-            <w:r>
-              <w:rPr>
-                <w:rFonts w:ascii="Consolas" w:hAnsi="Consolas"/>
-                <w:sz w:val="19"/>
-              </w:rPr>
-              <w:t>www.bnr.ro</w:t>
-            </w:r>
-          </w:p>
-        </w:tc>
-      </w:tr>
-      <w:tr>
-        <w:tc>
-          <w:tcPr>
-            <w:tcW w:type="dxa" w:w="3324"/>
-            <w:shd w:val="clear" w:color="auto" w:fill="EEF1F5"/>
-          </w:tcPr>
-          <w:p>
-            <w:pPr>
-              <w:spacing w:after="0"/>
-            </w:pPr>
-            <w:r>
-              <w:t>2.2</w:t>
-            </w:r>
-          </w:p>
-        </w:tc>
-        <w:tc>
-          <w:tcPr>
-            <w:tcW w:type="dxa" w:w="3324"/>
-            <w:shd w:val="clear" w:color="auto" w:fill="EEF1F5"/>
-          </w:tcPr>
-          <w:p>
-            <w:pPr>
-              <w:spacing w:after="0"/>
-            </w:pPr>
-            <w:r>
-              <w:t>ROBOR / IRCC actuale</w:t>
-            </w:r>
-          </w:p>
-        </w:tc>
-        <w:tc>
-          <w:tcPr>
-            <w:tcW w:type="dxa" w:w="3324"/>
-            <w:shd w:val="clear" w:color="auto" w:fill="EEF1F5"/>
-          </w:tcPr>
-          <w:p>
-            <w:pPr>
-              <w:spacing w:after="0"/>
-            </w:pPr>
-            <w:r>
-              <w:t xml:space="preserve">în bază sunt doar date vechi (4–17.09, fără IRCC); extracția de pe </w:t>
-            </w:r>
-            <w:r>
-              <w:rPr>
-                <w:rFonts w:ascii="Consolas" w:hAnsi="Consolas"/>
-                <w:sz w:val="19"/>
-              </w:rPr>
-              <w:t>www.bnr.ro</w:t>
-            </w:r>
-            <w:r>
-              <w:t xml:space="preserve"> merge, neîncărcată</w:t>
-            </w:r>
-          </w:p>
-        </w:tc>
-      </w:tr>
-      <w:tr>
-        <w:tc>
-          <w:tcPr>
-            <w:tcW w:type="dxa" w:w="3324"/>
-          </w:tcPr>
-          <w:p>
-            <w:pPr>
-              <w:spacing w:after="0"/>
-            </w:pPr>
-            <w:r>
-              <w:t>2.2</w:t>
-            </w:r>
-          </w:p>
-        </w:tc>
-        <w:tc>
-          <w:tcPr>
-            <w:tcW w:type="dxa" w:w="3324"/>
-          </w:tcPr>
-          <w:p>
-            <w:pPr>
-              <w:spacing w:after="0"/>
-            </w:pPr>
-            <w:r>
-              <w:t>EURIBOR</w:t>
-            </w:r>
-          </w:p>
-        </w:tc>
-        <w:tc>
-          <w:tcPr>
-            <w:tcW w:type="dxa" w:w="3324"/>
-          </w:tcPr>
-          <w:p>
-            <w:pPr>
-              <w:spacing w:after="0"/>
-            </w:pPr>
-            <w:r>
-              <w:t>neînceput</w:t>
-            </w:r>
-          </w:p>
-        </w:tc>
-      </w:tr>
-      <w:tr>
-        <w:tc>
-          <w:tcPr>
-            <w:tcW w:type="dxa" w:w="3324"/>
-            <w:shd w:val="clear" w:color="auto" w:fill="EEF1F5"/>
-          </w:tcPr>
-          <w:p>
-            <w:pPr>
-              <w:spacing w:after="0"/>
-            </w:pPr>
-            <w:r>
-              <w:t>2.3</w:t>
-            </w:r>
-          </w:p>
-        </w:tc>
-        <w:tc>
-          <w:tcPr>
-            <w:tcW w:type="dxa" w:w="3324"/>
-            <w:shd w:val="clear" w:color="auto" w:fill="EEF1F5"/>
-          </w:tcPr>
-          <w:p>
-            <w:pPr>
-              <w:spacing w:after="0"/>
-            </w:pPr>
-            <w:r>
-              <w:t>Android (Play Store, Exodus, APK)</w:t>
-            </w:r>
-          </w:p>
-        </w:tc>
-        <w:tc>
-          <w:tcPr>
-            <w:tcW w:type="dxa" w:w="3324"/>
-            <w:shd w:val="clear" w:color="auto" w:fill="EEF1F5"/>
-          </w:tcPr>
-          <w:p>
-            <w:pPr>
-              <w:spacing w:after="0"/>
-            </w:pPr>
-            <w:r>
-              <w:t>neînceput</w:t>
-            </w:r>
-          </w:p>
-        </w:tc>
-      </w:tr>
-      <w:tr>
-        <w:tc>
-          <w:tcPr>
-            <w:tcW w:type="dxa" w:w="3324"/>
-          </w:tcPr>
-          <w:p>
-            <w:pPr>
-              <w:spacing w:after="0"/>
-            </w:pPr>
-            <w:r>
-              <w:t>2.3</w:t>
-            </w:r>
-          </w:p>
-        </w:tc>
-        <w:tc>
-          <w:tcPr>
-            <w:tcW w:type="dxa" w:w="3324"/>
-          </w:tcPr>
-          <w:p>
-            <w:pPr>
-              <w:spacing w:after="0"/>
-            </w:pPr>
-            <w:r>
-              <w:t>Walkthrough pe device, feature matrix, internet banking public</w:t>
-            </w:r>
-          </w:p>
-        </w:tc>
-        <w:tc>
-          <w:tcPr>
-            <w:tcW w:type="dxa" w:w="3324"/>
-          </w:tcPr>
-          <w:p>
-            <w:pPr>
-              <w:spacing w:after="0"/>
-            </w:pPr>
-            <w:r>
-              <w:t>neînceput</w:t>
-            </w:r>
-          </w:p>
-        </w:tc>
-      </w:tr>
-      <w:tr>
-        <w:tc>
-          <w:tcPr>
-            <w:tcW w:type="dxa" w:w="3324"/>
-            <w:shd w:val="clear" w:color="auto" w:fill="EEF1F5"/>
-          </w:tcPr>
-          <w:p>
-            <w:pPr>
-              <w:spacing w:after="0"/>
-            </w:pPr>
-            <w:r>
-              <w:t>2.3 / 2.7</w:t>
-            </w:r>
-          </w:p>
-        </w:tc>
-        <w:tc>
-          <w:tcPr>
-            <w:tcW w:type="dxa" w:w="3324"/>
-            <w:shd w:val="clear" w:color="auto" w:fill="EEF1F5"/>
-          </w:tcPr>
-          <w:p>
-            <w:pPr>
-              <w:spacing w:after="0"/>
-            </w:pPr>
-            <w:r>
-              <w:t>Recenzii complete (sute pe aplicație)</w:t>
-            </w:r>
-          </w:p>
-        </w:tc>
-        <w:tc>
-          <w:tcPr>
-            <w:tcW w:type="dxa" w:w="3324"/>
-            <w:shd w:val="clear" w:color="auto" w:fill="EEF1F5"/>
-          </w:tcPr>
-          <w:p>
-            <w:pPr>
-              <w:spacing w:after="0"/>
-            </w:pPr>
-            <w:r>
-              <w:t>pagina publică arată ~8; restul doar prin furnizor licențiat</w:t>
-            </w:r>
-          </w:p>
-        </w:tc>
-      </w:tr>
-      <w:tr>
-        <w:tc>
-          <w:tcPr>
-            <w:tcW w:type="dxa" w:w="3324"/>
-          </w:tcPr>
-          <w:p>
-            <w:pPr>
-              <w:spacing w:after="0"/>
-            </w:pPr>
-            <w:r>
-              <w:rPr>
-                <w:b/>
-              </w:rPr>
-              <w:t>2.4 Campanii &amp; marketing</w:t>
-            </w:r>
-          </w:p>
-        </w:tc>
-        <w:tc>
-          <w:tcPr>
-            <w:tcW w:type="dxa" w:w="3324"/>
-          </w:tcPr>
-          <w:p>
-            <w:pPr>
-              <w:spacing w:after="0"/>
-            </w:pPr>
-            <w:r>
-              <w:t>tot: landing pages, reclame (Meta/TikTok/YouTube), newsroom, LinkedIn</w:t>
-            </w:r>
-          </w:p>
-        </w:tc>
-        <w:tc>
-          <w:tcPr>
-            <w:tcW w:type="dxa" w:w="3324"/>
-          </w:tcPr>
-          <w:p>
-            <w:pPr>
-              <w:spacing w:after="0"/>
-            </w:pPr>
-            <w:r>
-              <w:t>neînceput</w:t>
-            </w:r>
-          </w:p>
-        </w:tc>
-      </w:tr>
-      <w:tr>
-        <w:tc>
-          <w:tcPr>
-            <w:tcW w:type="dxa" w:w="3324"/>
-            <w:shd w:val="clear" w:color="auto" w:fill="EEF1F5"/>
-          </w:tcPr>
-          <w:p>
-            <w:pPr>
-              <w:spacing w:after="0"/>
-            </w:pPr>
-            <w:r>
-              <w:t>2.5</w:t>
-            </w:r>
-          </w:p>
-        </w:tc>
-        <w:tc>
-          <w:tcPr>
-            <w:tcW w:type="dxa" w:w="3324"/>
-            <w:shd w:val="clear" w:color="auto" w:fill="EEF1F5"/>
-          </w:tcPr>
-          <w:p>
-            <w:pPr>
-              <w:spacing w:after="0"/>
-            </w:pPr>
-            <w:r>
-              <w:t>Program sucursale; locatoarele băncilor (în afară de Patria)</w:t>
-            </w:r>
-          </w:p>
-        </w:tc>
-        <w:tc>
-          <w:tcPr>
-            <w:tcW w:type="dxa" w:w="3324"/>
-            <w:shd w:val="clear" w:color="auto" w:fill="EEF1F5"/>
-          </w:tcPr>
-          <w:p>
-            <w:pPr>
-              <w:spacing w:after="0"/>
-            </w:pPr>
-            <w:r>
-              <w:t>API-ul hărții interzis de robots.txt (BRD, CreditCoop, Libra) sau fără coordonate</w:t>
-            </w:r>
-          </w:p>
-        </w:tc>
-      </w:tr>
-      <w:tr>
-        <w:tc>
-          <w:tcPr>
-            <w:tcW w:type="dxa" w:w="3324"/>
-          </w:tcPr>
-          <w:p>
-            <w:pPr>
-              <w:spacing w:after="0"/>
-            </w:pPr>
-            <w:r>
-              <w:t>2.5</w:t>
-            </w:r>
-          </w:p>
-        </w:tc>
-        <w:tc>
-          <w:tcPr>
-            <w:tcW w:type="dxa" w:w="3324"/>
-          </w:tcPr>
-          <w:p>
-            <w:pPr>
-              <w:spacing w:after="0"/>
-            </w:pPr>
-            <w:r>
-              <w:t>Job postings</w:t>
-            </w:r>
-          </w:p>
-        </w:tc>
-        <w:tc>
-          <w:tcPr>
-            <w:tcW w:type="dxa" w:w="3324"/>
-          </w:tcPr>
-          <w:p>
-            <w:pPr>
-              <w:spacing w:after="0"/>
-            </w:pPr>
-            <w:r>
-              <w:t>neînceput</w:t>
+              <w:t>propus</w:t>
             </w:r>
           </w:p>
         </w:tc>
@@ -1333,7 +761,10 @@
               <w:rPr>
                 <w:b/>
               </w:rPr>
-              <w:t>2.6 Context de piață</w:t>
+              <w:t>Job postings</w:t>
+            </w:r>
+            <w:r>
+              <w:t xml:space="preserve"> (2.5)</w:t>
             </w:r>
           </w:p>
         </w:tc>
@@ -1347,7 +778,7 @@
               <w:spacing w:after="0"/>
             </w:pPr>
             <w:r>
-              <w:t>tot: statistici BNR, ARB, rapoarte financiare, ANPC/CSALB</w:t>
+              <w:t>Anunțurile de angajare ale băncilor</w:t>
             </w:r>
           </w:p>
         </w:tc>
@@ -1361,7 +792,7 @@
               <w:spacing w:after="0"/>
             </w:pPr>
             <w:r>
-              <w:t>neînceput</w:t>
+              <w:t>propus</w:t>
             </w:r>
           </w:p>
         </w:tc>
@@ -1376,7 +807,13 @@
               <w:spacing w:after="0"/>
             </w:pPr>
             <w:r>
-              <w:t>2.7</w:t>
+              <w:rPr>
+                <w:b/>
+              </w:rPr>
+              <w:t>Context de piață</w:t>
+            </w:r>
+            <w:r>
+              <w:t xml:space="preserve"> (2.6)</w:t>
             </w:r>
           </w:p>
         </w:tc>
@@ -1389,7 +826,7 @@
               <w:spacing w:after="0"/>
             </w:pPr>
             <w:r>
-              <w:t>Trustpilot, Google Business</w:t>
+              <w:t>Statistici BNR și ARB, rapoarte financiare, reclamații ANPC / CSALB</w:t>
             </w:r>
           </w:p>
         </w:tc>
@@ -1402,7 +839,7 @@
               <w:spacing w:after="0"/>
             </w:pPr>
             <w:r>
-              <w:t>neînceput</w:t>
+              <w:t>propus</w:t>
             </w:r>
           </w:p>
         </w:tc>
@@ -1418,7 +855,13 @@
               <w:spacing w:after="0"/>
             </w:pPr>
             <w:r>
-              <w:t>3. Competitori</w:t>
+              <w:rPr>
+                <w:b/>
+              </w:rPr>
+              <w:t>Recenzii complete</w:t>
+            </w:r>
+            <w:r>
+              <w:t xml:space="preserve"> (2.7)</w:t>
             </w:r>
           </w:p>
         </w:tc>
@@ -1432,7 +875,7 @@
               <w:spacing w:after="0"/>
             </w:pPr>
             <w:r>
-              <w:t>Alpha Bank, OTP, First Bank (Nivel 1); tot Nivelul 2 (Wise, N26, bunq…) și Nivelul 3</w:t>
+              <w:t>Istoricul complet al recenziilor din App Store</w:t>
             </w:r>
           </w:p>
         </w:tc>
@@ -1446,58 +889,107 @@
               <w:spacing w:after="0"/>
             </w:pPr>
             <w:r>
-              <w:t>nu sunt în lista celor 30 de bănci</w:t>
+              <w:t>propus</w:t>
+            </w:r>
+          </w:p>
+        </w:tc>
+      </w:tr>
+      <w:tr>
+        <w:tc>
+          <w:tcPr>
+            <w:tcW w:type="dxa" w:w="3324"/>
+          </w:tcPr>
+          <w:p>
+            <w:pPr>
+              <w:spacing w:after="0"/>
+            </w:pPr>
+            <w:r>
+              <w:rPr>
+                <w:b/>
+              </w:rPr>
+              <w:t>Recenzii Trustpilot și Google</w:t>
+            </w:r>
+            <w:r>
+              <w:t xml:space="preserve"> (2.7)</w:t>
+            </w:r>
+          </w:p>
+        </w:tc>
+        <w:tc>
+          <w:tcPr>
+            <w:tcW w:type="dxa" w:w="3324"/>
+          </w:tcPr>
+          <w:p>
+            <w:pPr>
+              <w:spacing w:after="0"/>
+            </w:pPr>
+            <w:r>
+              <w:t>Recenzii despre bănci și sucursale</w:t>
+            </w:r>
+          </w:p>
+        </w:tc>
+        <w:tc>
+          <w:tcPr>
+            <w:tcW w:type="dxa" w:w="3324"/>
+          </w:tcPr>
+          <w:p>
+            <w:pPr>
+              <w:spacing w:after="0"/>
+            </w:pPr>
+            <w:r>
+              <w:t>propus</w:t>
+            </w:r>
+          </w:p>
+        </w:tc>
+      </w:tr>
+      <w:tr>
+        <w:tc>
+          <w:tcPr>
+            <w:tcW w:type="dxa" w:w="3324"/>
+            <w:shd w:val="clear" w:color="auto" w:fill="EEF1F5"/>
+          </w:tcPr>
+          <w:p>
+            <w:pPr>
+              <w:spacing w:after="0"/>
+            </w:pPr>
+            <w:r>
+              <w:rPr>
+                <w:b/>
+              </w:rPr>
+              <w:t>Competitori Nivel 2–3</w:t>
+            </w:r>
+          </w:p>
+        </w:tc>
+        <w:tc>
+          <w:tcPr>
+            <w:tcW w:type="dxa" w:w="3324"/>
+            <w:shd w:val="clear" w:color="auto" w:fill="EEF1F5"/>
+          </w:tcPr>
+          <w:p>
+            <w:pPr>
+              <w:spacing w:after="0"/>
+            </w:pPr>
+            <w:r>
+              <w:t>Fintech-uri și bănci externe (Wise, N26, bunq, ING NL…)</w:t>
+            </w:r>
+          </w:p>
+        </w:tc>
+        <w:tc>
+          <w:tcPr>
+            <w:tcW w:type="dxa" w:w="3324"/>
+            <w:shd w:val="clear" w:color="auto" w:fill="EEF1F5"/>
+          </w:tcPr>
+          <w:p>
+            <w:pPr>
+              <w:spacing w:after="0"/>
+            </w:pPr>
+            <w:r>
+              <w:t>propus</w:t>
             </w:r>
           </w:p>
         </w:tc>
       </w:tr>
     </w:tbl>
     <w:p/>
-    <w:p>
-      <w:pPr>
-        <w:pStyle w:val="Heading1"/>
-      </w:pPr>
-      <w:r>
-        <w:rPr>
-          <w:color w:val="142B4C"/>
-        </w:rPr>
-        <w:t>Calitate — de îmbunătățit</w:t>
-      </w:r>
-    </w:p>
-    <w:p>
-      <w:pPr>
-        <w:pStyle w:val="ListBullet"/>
-      </w:pPr>
-      <w:r>
-        <w:t>Concept comparabil între bănci: 65% (cea mai mare pârghie pentru comparații)</w:t>
-      </w:r>
-    </w:p>
-    <w:p>
-      <w:pPr>
-        <w:pStyle w:val="ListBullet"/>
-      </w:pPr>
-      <w:r>
-        <w:t xml:space="preserve">Pagini fără </w:t>
-      </w:r>
-      <w:r>
-        <w:rPr>
-          <w:rFonts w:ascii="Consolas" w:hAnsi="Consolas"/>
-          <w:sz w:val="19"/>
-        </w:rPr>
-        <w:t>&lt;main&gt;</w:t>
-      </w:r>
-      <w:r>
-        <w:t xml:space="preserve"> (ex. ING): conținutul principal ales greșit → dobânzi pierdute</w:t>
-      </w:r>
-    </w:p>
-    <w:p>
-      <w:pPr>
-        <w:pStyle w:val="ListBullet"/>
-      </w:pPr>
-      <w:r>
-        <w:t>BCR: 13.661 de valori — de verificat versiunile vechi din arhivă</w:t>
-      </w:r>
-    </w:p>
     <w:sectPr>
       <w:pgSz w:w="12240" w:h="15840"/>
       <w:pgMar w:top="1020" w:right="1134" w:bottom="1020" w:left="1134" w:header="720" w:footer="720" w:gutter="0"/>

</xml_diff>